<commit_message>
CRM-Prüfprotokoll: Löschfristen auf Datenschutzseite und in AVV Anhang 3 (live seit 18.10., CRM acbb903); Hetzner-Zeile präzisiert
- 12 Monate allgemein; dsr.* bis Ende des 3. Folgejahres (§ 199 Abs. 1 BGB); Abrechnung bis Ende des 10. Jahres (§ 147 Abs. 3/4 AO)
- Quelle: apps/api/src/audit/audit-log-sweep.ts (AUDIT_LOG_RETENTION_MONTHS, AUDIT_LOG_DSR_RETENTION_YEARS, AUDIT_LOG_BILLING_RETENTION_YEARS)
- AVV Anhang 2: Hetzner auch für die nächtliche verschlüsselte Sicherung des Mailagenten

Co-Authored-By: Claude Opus 5.5 <noreply@anthropic.com>
</commit_message>
<xml_diff>
--- a/vertrag/04_AnlageB_AVV_Auftragsverarbeitung.docx
+++ b/vertrag/04_AnlageB_AVV_Auftragsverarbeitung.docx
@@ -6433,7 +6433,7 @@
                 <w:sz w:val="20"/>
                 <w:szCs w:val="20"/>
               </w:rPr>
-              <w:t xml:space="preserve">Hosting und Betrieb der von NexAI selbst betriebenen Systeme (Automatisierungen/n8n, NexAI CRM bei Betrieb durch NexAI, NexAI Kalender, NexAI Mailagent, NexAI App) und Ablage der Sicherungen</w:t>
+              <w:t xml:space="preserve">Hosting und Betrieb der von NexAI selbst betriebenen Systeme (Automatisierungen/n8n, NexAI CRM bei Betrieb durch NexAI, NexAI Kalender, NexAI Mailagent einschließlich nächtlicher verschlüsselter Sicherung, NexAI App) und Ablage der Sicherungen</w:t>
             </w:r>
           </w:p>
         </w:tc>
@@ -8600,7 +8600,7 @@
                 <w:sz w:val="20"/>
                 <w:szCs w:val="20"/>
               </w:rPr>
-              <w:t xml:space="preserve">derzeit keine automatische Löschung</w:t>
+              <w:t xml:space="preserve">12 Monate; Einträge zu Auskunfts- und Löschanträgen bis zum Ende des dritten Jahres nach dem Eintragsjahr; Einträge zur Abrechnung bis zum Ende des zehnten Jahres</w:t>
             </w:r>
           </w:p>
         </w:tc>

</xml_diff>

<commit_message>
Mailagent 04c21f1 live (19.10. 00:25): Automatik versendet keine erkannten Zusagen/Absagen und nicht in Schleifen — Anlage A 5.4 Abs. (1) und AVV (Kategorien, Anhang 3 Schleifenschutz)
Formulierung als Erkennung, nicht als Zusicherung: src/entwurf/bindung.ts ist eine Heuristik
(Modellmarke + Wortliste), die Schleifenerkennung ebenso (In-Reply-To/References oder Re:/AW:).
Code: nexai-mailagent 12684e7 (automatik.ts:58, :85, :130-136), loeschen.ts:266-270 (Nachrichtenfrist),
betroffene.ts:127/148 (Löschung auf Verlangen).

Co-Authored-By: Claude Opus 5.5 <noreply@anthropic.com>
</commit_message>
<xml_diff>
--- a/vertrag/04_AnlageB_AVV_Auftragsverarbeitung.docx
+++ b/vertrag/04_AnlageB_AVV_Auftragsverarbeitung.docx
@@ -1192,7 +1192,7 @@
           <w:sz w:val="21"/>
           <w:szCs w:val="21"/>
         </w:rPr>
-        <w:t xml:space="preserve">beim NexAI Mailagent: vollständiger Inhalt von Nachrichten und Anhängen, Kopf- und Verkehrsdaten, in der Korrespondenz enthaltene Zahlungsdaten (insbesondere Bankverbindungen) sowie die vom System erzeugten Bewertungen (Einstufung, Zusammenfassung, Tonfall, Betrugsbewertung, erkannte Fristen und Rechnungen), Antwortentwürfe, das Freigabeprotokoll (Person, Zeitpunkt, Aktion, Betreff, Wortlaut, Prüfsumme) und das Verwaltungsprotokoll; ferner Name, Anmeldeadresse und Rolle der vom Kunden angelegten Personen und die ihnen zugeordneten Postfächer, ein Abdruck des Passworts, das verschlüsselt gespeicherte Geheimnis des zweiten Faktors, offene Sitzungen, Zuweisungen, interne Notizen und Abwesenheiten mit Vertretung sowie die verschlüsselt gespeicherten Zugangsdaten zu den Postfächern des Kunden.</w:t>
+        <w:t xml:space="preserve">beim NexAI Mailagent: vollständiger Inhalt von Nachrichten und Anhängen, Kopf- und Verkehrsdaten, in der Korrespondenz enthaltene Zahlungsdaten (insbesondere Bankverbindungen) sowie die vom System erzeugten Bewertungen (Einstufung, Zusammenfassung, Tonfall, Betrugsbewertung, erkannte Fristen und Rechnungen), Antwortentwürfe, das Freigabeprotokoll (Person, Zeitpunkt, Aktion, Betreff, Wortlaut, Prüfsumme), das Verwaltungsprotokoll und zu selbsttätig versandten Antworten Empfänger, Betreff und Message-ID (Schleifenschutz); ferner Name, Anmeldeadresse und Rolle der vom Kunden angelegten Personen und die ihnen zugeordneten Postfächer, ein Abdruck des Passworts, das verschlüsselt gespeicherte Geheimnis des zweiten Faktors, offene Sitzungen, Zuweisungen, interne Notizen und Abwesenheiten mit Vertretung sowie die verschlüsselt gespeicherten Zugangsdaten zu den Postfächern des Kunden.</w:t>
       </w:r>
     </w:p>
     <w:p>
@@ -9729,6 +9729,95 @@
                 <w:szCs w:val="20"/>
               </w:rPr>
               <w:t xml:space="preserve">Tagesübersichten</w:t>
+            </w:r>
+          </w:p>
+        </w:tc>
+        <w:tc>
+          <w:tcPr>
+            <w:tcW w:type="dxa" w:w="3135"/>
+            <w:tcMar>
+              <w:top w:type="dxa" w:w="60"/>
+              <w:left w:type="dxa" w:w="90"/>
+              <w:bottom w:type="dxa" w:w="60"/>
+              <w:right w:type="dxa" w:w="90"/>
+            </w:tcMar>
+          </w:tcPr>
+          <w:p>
+            <w:pPr>
+              <w:spacing w:after="0" w:line="264"/>
+            </w:pPr>
+            <w:r>
+              <w:rPr>
+                <w:rFonts w:ascii="Arial" w:cs="Arial" w:eastAsia="Arial" w:hAnsi="Arial"/>
+                <w:b w:val="false"/>
+                <w:bCs w:val="false"/>
+                <w:i w:val="false"/>
+                <w:iCs w:val="false"/>
+                <w:color w:val="1A1A1A"/>
+                <w:sz w:val="20"/>
+                <w:szCs w:val="20"/>
+              </w:rPr>
+              <w:t xml:space="preserve">wie Nachrichten (Vorgabe 180 Tage)</w:t>
+            </w:r>
+          </w:p>
+        </w:tc>
+      </w:tr>
+      <w:tr>
+        <w:tc>
+          <w:tcPr>
+            <w:tcW w:type="dxa" w:w="3135"/>
+            <w:tcMar>
+              <w:top w:type="dxa" w:w="60"/>
+              <w:left w:type="dxa" w:w="90"/>
+              <w:bottom w:type="dxa" w:w="60"/>
+              <w:right w:type="dxa" w:w="90"/>
+            </w:tcMar>
+          </w:tcPr>
+          <w:p>
+            <w:pPr>
+              <w:spacing w:after="0" w:line="264"/>
+            </w:pPr>
+            <w:r>
+              <w:rPr>
+                <w:rFonts w:ascii="Arial" w:cs="Arial" w:eastAsia="Arial" w:hAnsi="Arial"/>
+                <w:b w:val="false"/>
+                <w:bCs w:val="false"/>
+                <w:i w:val="false"/>
+                <w:iCs w:val="false"/>
+                <w:color w:val="1A1A1A"/>
+                <w:sz w:val="20"/>
+                <w:szCs w:val="20"/>
+              </w:rPr>
+              <w:t xml:space="preserve">NexAI Mailagent</w:t>
+            </w:r>
+          </w:p>
+        </w:tc>
+        <w:tc>
+          <w:tcPr>
+            <w:tcW w:type="dxa" w:w="3135"/>
+            <w:tcMar>
+              <w:top w:type="dxa" w:w="60"/>
+              <w:left w:type="dxa" w:w="90"/>
+              <w:bottom w:type="dxa" w:w="60"/>
+              <w:right w:type="dxa" w:w="90"/>
+            </w:tcMar>
+          </w:tcPr>
+          <w:p>
+            <w:pPr>
+              <w:spacing w:after="0" w:line="264"/>
+            </w:pPr>
+            <w:r>
+              <w:rPr>
+                <w:rFonts w:ascii="Arial" w:cs="Arial" w:eastAsia="Arial" w:hAnsi="Arial"/>
+                <w:b w:val="false"/>
+                <w:bCs w:val="false"/>
+                <w:i w:val="false"/>
+                <w:iCs w:val="false"/>
+                <w:color w:val="1A1A1A"/>
+                <w:sz w:val="20"/>
+                <w:szCs w:val="20"/>
+              </w:rPr>
+              <w:t xml:space="preserve">Schleifenschutz der Automatik (Empfänger, Betreff und Message-ID selbsttätig versandter Antworten)</w:t>
             </w:r>
           </w:p>
         </w:tc>

</xml_diff>